<commit_message>
Actualizacion de Documento de Proyecto Final docx
</commit_message>
<xml_diff>
--- a/DESCRIPCION DE PUESTO - ENCARGADO DE MOSTRADOR.docx
+++ b/DESCRIPCION DE PUESTO - ENCARGADO DE MOSTRADOR.docx
@@ -94,6 +94,7 @@
                 <w:szCs w:val="16"/>
               </w:rPr>
             </w:pPr>
+            <w:bookmarkStart w:id="1" w:name="_Hlk229663248"/>
             <w:r>
               <w:rPr>
                 <w:rFonts w:ascii="Century Gothic" w:eastAsia="Century Gothic" w:hAnsi="Century Gothic" w:cs="Century Gothic"/>
@@ -334,39 +335,7 @@
                 <w:sz w:val="16"/>
                 <w:szCs w:val="16"/>
               </w:rPr>
-              <w:t>19</w:t>
-            </w:r>
-            <w:r>
-              <w:rPr>
-                <w:rFonts w:ascii="Century Gothic" w:eastAsia="Century Gothic" w:hAnsi="Century Gothic" w:cs="Century Gothic"/>
-                <w:sz w:val="16"/>
-                <w:szCs w:val="16"/>
-              </w:rPr>
-              <w:t>/MA</w:t>
-            </w:r>
-            <w:r>
-              <w:rPr>
-                <w:rFonts w:ascii="Century Gothic" w:eastAsia="Century Gothic" w:hAnsi="Century Gothic" w:cs="Century Gothic"/>
-                <w:sz w:val="16"/>
-                <w:szCs w:val="16"/>
-              </w:rPr>
-              <w:t>RZO</w:t>
-            </w:r>
-            <w:r>
-              <w:rPr>
-                <w:rFonts w:ascii="Century Gothic" w:eastAsia="Century Gothic" w:hAnsi="Century Gothic" w:cs="Century Gothic"/>
-                <w:sz w:val="16"/>
-                <w:szCs w:val="16"/>
-              </w:rPr>
-              <w:t>/202</w:t>
-            </w:r>
-            <w:r>
-              <w:rPr>
-                <w:rFonts w:ascii="Century Gothic" w:eastAsia="Century Gothic" w:hAnsi="Century Gothic" w:cs="Century Gothic"/>
-                <w:sz w:val="16"/>
-                <w:szCs w:val="16"/>
-              </w:rPr>
-              <w:t>6</w:t>
+              <w:t>19/MARZO/2026</w:t>
             </w:r>
           </w:p>
         </w:tc>
@@ -811,9 +780,9 @@
                 <w:szCs w:val="24"/>
               </w:rPr>
               <w:drawing>
-                <wp:inline distT="0" distB="0" distL="0" distR="0" wp14:anchorId="72B3F16B" wp14:editId="3D4E2757">
+                <wp:inline distT="0" distB="0" distL="0" distR="0" wp14:anchorId="72B3F16B" wp14:editId="0126CED5">
                   <wp:extent cx="3073400" cy="2552700"/>
-                  <wp:effectExtent l="76200" t="0" r="88900" b="0"/>
+                  <wp:effectExtent l="95250" t="0" r="127000" b="0"/>
                   <wp:docPr id="2" name="Diagrama 2"/>
                   <wp:cNvGraphicFramePr/>
                   <a:graphic xmlns:a="http://schemas.openxmlformats.org/drawingml/2006/main">
@@ -2140,6 +2109,7 @@
           </w:p>
         </w:tc>
       </w:tr>
+      <w:bookmarkEnd w:id="1"/>
     </w:tbl>
     <w:p>
       <w:pPr>
@@ -3967,42 +3937,6 @@
         </a:p>
       </dgm:t>
     </dgm:pt>
-    <dgm:pt modelId="{3C21F224-0028-43F7-8120-6BC4FD93406E}">
-      <dgm:prSet phldrT="[Texto]"/>
-      <dgm:spPr/>
-      <dgm:t>
-        <a:bodyPr/>
-        <a:lstStyle/>
-        <a:p>
-          <a:r>
-            <a:rPr lang="es-MX"/>
-            <a:t>TÉCNICO EN IMPRESIÓN ESPECIALIZADA</a:t>
-          </a:r>
-        </a:p>
-      </dgm:t>
-    </dgm:pt>
-    <dgm:pt modelId="{7DEB1F69-5951-4E91-8742-0D33F3E9726F}" type="parTrans" cxnId="{6D044A9A-8CFC-442E-B031-882B44A2F3F9}">
-      <dgm:prSet/>
-      <dgm:spPr/>
-      <dgm:t>
-        <a:bodyPr/>
-        <a:lstStyle/>
-        <a:p>
-          <a:endParaRPr lang="es-MX"/>
-        </a:p>
-      </dgm:t>
-    </dgm:pt>
-    <dgm:pt modelId="{6E712408-C0C5-409A-8276-838F5B3A1249}" type="sibTrans" cxnId="{6D044A9A-8CFC-442E-B031-882B44A2F3F9}">
-      <dgm:prSet/>
-      <dgm:spPr/>
-      <dgm:t>
-        <a:bodyPr/>
-        <a:lstStyle/>
-        <a:p>
-          <a:endParaRPr lang="es-MX"/>
-        </a:p>
-      </dgm:t>
-    </dgm:pt>
     <dgm:pt modelId="{E7A003C0-7AEB-4C63-8B3E-4821A0929CA4}" type="pres">
       <dgm:prSet presAssocID="{C4C5F2A0-62F3-4284-97E3-D6BF701E8340}" presName="hierChild1" presStyleCnt="0">
         <dgm:presLayoutVars>
@@ -4045,7 +3979,7 @@
       <dgm:spPr/>
     </dgm:pt>
     <dgm:pt modelId="{EB603296-35E9-44DB-97AC-E4F2CC8CF297}" type="pres">
-      <dgm:prSet presAssocID="{F771143B-0C93-4223-891B-2C5580A9081D}" presName="Name37" presStyleLbl="parChTrans1D2" presStyleIdx="0" presStyleCnt="4"/>
+      <dgm:prSet presAssocID="{F771143B-0C93-4223-891B-2C5580A9081D}" presName="Name37" presStyleLbl="parChTrans1D2" presStyleIdx="0" presStyleCnt="3"/>
       <dgm:spPr/>
     </dgm:pt>
     <dgm:pt modelId="{BE5A4977-81C5-42A8-9D38-868DCD5606BC}" type="pres">
@@ -4061,7 +3995,7 @@
       <dgm:spPr/>
     </dgm:pt>
     <dgm:pt modelId="{0AE09A4A-865F-46BA-B1CF-67BB004CBF34}" type="pres">
-      <dgm:prSet presAssocID="{01C0A4C0-4C0D-4336-825C-FBB300626B2A}" presName="rootText" presStyleLbl="node2" presStyleIdx="0" presStyleCnt="4">
+      <dgm:prSet presAssocID="{01C0A4C0-4C0D-4336-825C-FBB300626B2A}" presName="rootText" presStyleLbl="node2" presStyleIdx="0" presStyleCnt="3">
         <dgm:presLayoutVars>
           <dgm:chPref val="3"/>
         </dgm:presLayoutVars>
@@ -4069,7 +4003,7 @@
       <dgm:spPr/>
     </dgm:pt>
     <dgm:pt modelId="{D52A3997-F632-477A-9CC3-6805579B71D9}" type="pres">
-      <dgm:prSet presAssocID="{01C0A4C0-4C0D-4336-825C-FBB300626B2A}" presName="rootConnector" presStyleLbl="node2" presStyleIdx="0" presStyleCnt="4"/>
+      <dgm:prSet presAssocID="{01C0A4C0-4C0D-4336-825C-FBB300626B2A}" presName="rootConnector" presStyleLbl="node2" presStyleIdx="0" presStyleCnt="3"/>
       <dgm:spPr/>
     </dgm:pt>
     <dgm:pt modelId="{E06F1137-0E58-4D45-8E01-004BFC39CF2D}" type="pres">
@@ -4081,7 +4015,7 @@
       <dgm:spPr/>
     </dgm:pt>
     <dgm:pt modelId="{DD7211EF-D45F-451F-A090-C225A644391A}" type="pres">
-      <dgm:prSet presAssocID="{40A68914-ABD9-443B-9454-67232C7559D6}" presName="Name37" presStyleLbl="parChTrans1D2" presStyleIdx="1" presStyleCnt="4"/>
+      <dgm:prSet presAssocID="{40A68914-ABD9-443B-9454-67232C7559D6}" presName="Name37" presStyleLbl="parChTrans1D2" presStyleIdx="1" presStyleCnt="3"/>
       <dgm:spPr/>
     </dgm:pt>
     <dgm:pt modelId="{55904E33-22F7-42F3-8177-C9D50EBF7ED7}" type="pres">
@@ -4097,7 +4031,7 @@
       <dgm:spPr/>
     </dgm:pt>
     <dgm:pt modelId="{03AA56DD-BB38-41C5-85DA-7449B7097E61}" type="pres">
-      <dgm:prSet presAssocID="{EA3DE49E-1D54-421C-9F81-14D2CE393ED7}" presName="rootText" presStyleLbl="node2" presStyleIdx="1" presStyleCnt="4">
+      <dgm:prSet presAssocID="{EA3DE49E-1D54-421C-9F81-14D2CE393ED7}" presName="rootText" presStyleLbl="node2" presStyleIdx="1" presStyleCnt="3">
         <dgm:presLayoutVars>
           <dgm:chPref val="3"/>
         </dgm:presLayoutVars>
@@ -4105,7 +4039,7 @@
       <dgm:spPr/>
     </dgm:pt>
     <dgm:pt modelId="{1F6DE591-354B-4649-B1B1-995F746ED77F}" type="pres">
-      <dgm:prSet presAssocID="{EA3DE49E-1D54-421C-9F81-14D2CE393ED7}" presName="rootConnector" presStyleLbl="node2" presStyleIdx="1" presStyleCnt="4"/>
+      <dgm:prSet presAssocID="{EA3DE49E-1D54-421C-9F81-14D2CE393ED7}" presName="rootConnector" presStyleLbl="node2" presStyleIdx="1" presStyleCnt="3"/>
       <dgm:spPr/>
     </dgm:pt>
     <dgm:pt modelId="{A35F89DB-A936-48FD-B1B1-928766FC6596}" type="pres">
@@ -4117,7 +4051,7 @@
       <dgm:spPr/>
     </dgm:pt>
     <dgm:pt modelId="{48EF1B20-6639-4448-A2AD-54499524E618}" type="pres">
-      <dgm:prSet presAssocID="{340E6BBD-CB2F-4FB6-90FE-2BB2B0066255}" presName="Name37" presStyleLbl="parChTrans1D2" presStyleIdx="2" presStyleCnt="4"/>
+      <dgm:prSet presAssocID="{340E6BBD-CB2F-4FB6-90FE-2BB2B0066255}" presName="Name37" presStyleLbl="parChTrans1D2" presStyleIdx="2" presStyleCnt="3"/>
       <dgm:spPr/>
     </dgm:pt>
     <dgm:pt modelId="{C5420597-0461-4952-A92D-CA34B0A741FB}" type="pres">
@@ -4133,7 +4067,7 @@
       <dgm:spPr/>
     </dgm:pt>
     <dgm:pt modelId="{4FD19808-1664-4492-A4B2-749AA80D9B0C}" type="pres">
-      <dgm:prSet presAssocID="{9570F37F-2026-4982-837A-92ED8C752832}" presName="rootText" presStyleLbl="node2" presStyleIdx="2" presStyleCnt="4">
+      <dgm:prSet presAssocID="{9570F37F-2026-4982-837A-92ED8C752832}" presName="rootText" presStyleLbl="node2" presStyleIdx="2" presStyleCnt="3">
         <dgm:presLayoutVars>
           <dgm:chPref val="3"/>
         </dgm:presLayoutVars>
@@ -4141,7 +4075,7 @@
       <dgm:spPr/>
     </dgm:pt>
     <dgm:pt modelId="{80392DB4-8E14-4BDC-A22A-B86C8509A595}" type="pres">
-      <dgm:prSet presAssocID="{9570F37F-2026-4982-837A-92ED8C752832}" presName="rootConnector" presStyleLbl="node2" presStyleIdx="2" presStyleCnt="4"/>
+      <dgm:prSet presAssocID="{9570F37F-2026-4982-837A-92ED8C752832}" presName="rootConnector" presStyleLbl="node2" presStyleIdx="2" presStyleCnt="3"/>
       <dgm:spPr/>
     </dgm:pt>
     <dgm:pt modelId="{9634CE69-7362-4D64-A21C-51D1C69ABF5E}" type="pres">
@@ -4150,42 +4084,6 @@
     </dgm:pt>
     <dgm:pt modelId="{AD9DBCBC-6165-4999-8732-14FA4AD1B665}" type="pres">
       <dgm:prSet presAssocID="{9570F37F-2026-4982-837A-92ED8C752832}" presName="hierChild5" presStyleCnt="0"/>
-      <dgm:spPr/>
-    </dgm:pt>
-    <dgm:pt modelId="{11A24AAD-4F5F-4584-BB27-68F45D313A90}" type="pres">
-      <dgm:prSet presAssocID="{7DEB1F69-5951-4E91-8742-0D33F3E9726F}" presName="Name37" presStyleLbl="parChTrans1D2" presStyleIdx="3" presStyleCnt="4"/>
-      <dgm:spPr/>
-    </dgm:pt>
-    <dgm:pt modelId="{5E137D6B-4327-4362-BA47-7A05500BFB52}" type="pres">
-      <dgm:prSet presAssocID="{3C21F224-0028-43F7-8120-6BC4FD93406E}" presName="hierRoot2" presStyleCnt="0">
-        <dgm:presLayoutVars>
-          <dgm:hierBranch val="init"/>
-        </dgm:presLayoutVars>
-      </dgm:prSet>
-      <dgm:spPr/>
-    </dgm:pt>
-    <dgm:pt modelId="{93F7292F-D094-4600-8DE3-0D339ED59BE9}" type="pres">
-      <dgm:prSet presAssocID="{3C21F224-0028-43F7-8120-6BC4FD93406E}" presName="rootComposite" presStyleCnt="0"/>
-      <dgm:spPr/>
-    </dgm:pt>
-    <dgm:pt modelId="{D69B7613-0838-4B69-ABC2-444FC2ADC560}" type="pres">
-      <dgm:prSet presAssocID="{3C21F224-0028-43F7-8120-6BC4FD93406E}" presName="rootText" presStyleLbl="node2" presStyleIdx="3" presStyleCnt="4">
-        <dgm:presLayoutVars>
-          <dgm:chPref val="3"/>
-        </dgm:presLayoutVars>
-      </dgm:prSet>
-      <dgm:spPr/>
-    </dgm:pt>
-    <dgm:pt modelId="{D5DBBB32-2AEF-44D8-ACCB-9F07F9BE497B}" type="pres">
-      <dgm:prSet presAssocID="{3C21F224-0028-43F7-8120-6BC4FD93406E}" presName="rootConnector" presStyleLbl="node2" presStyleIdx="3" presStyleCnt="4"/>
-      <dgm:spPr/>
-    </dgm:pt>
-    <dgm:pt modelId="{2FD5043C-A5BB-47B5-939B-82511445F26D}" type="pres">
-      <dgm:prSet presAssocID="{3C21F224-0028-43F7-8120-6BC4FD93406E}" presName="hierChild4" presStyleCnt="0"/>
-      <dgm:spPr/>
-    </dgm:pt>
-    <dgm:pt modelId="{6FC12D20-B97C-4D55-B46F-BD2637615EB4}" type="pres">
-      <dgm:prSet presAssocID="{3C21F224-0028-43F7-8120-6BC4FD93406E}" presName="hierChild5" presStyleCnt="0"/>
       <dgm:spPr/>
     </dgm:pt>
     <dgm:pt modelId="{F3987164-6F42-419A-AAAF-3DCD67CC87F8}" type="pres">
@@ -4206,13 +4104,9 @@
     <dgm:cxn modelId="{77E57D78-FDE8-41C3-A18D-29A74F7D20F7}" srcId="{FBC6C2C6-7DAF-4659-95E6-DFCABC76B7EC}" destId="{9570F37F-2026-4982-837A-92ED8C752832}" srcOrd="2" destOrd="0" parTransId="{340E6BBD-CB2F-4FB6-90FE-2BB2B0066255}" sibTransId="{F8D60DC2-0505-4CFC-8726-E2AFDC90FFD4}"/>
     <dgm:cxn modelId="{5B374F5A-6AA9-4534-AC7C-BADA587BE88B}" type="presOf" srcId="{F771143B-0C93-4223-891B-2C5580A9081D}" destId="{EB603296-35E9-44DB-97AC-E4F2CC8CF297}" srcOrd="0" destOrd="0" presId="urn:microsoft.com/office/officeart/2005/8/layout/orgChart1"/>
     <dgm:cxn modelId="{412E617F-2C6E-4C00-A50E-C2F54890EBA0}" type="presOf" srcId="{340E6BBD-CB2F-4FB6-90FE-2BB2B0066255}" destId="{48EF1B20-6639-4448-A2AD-54499524E618}" srcOrd="0" destOrd="0" presId="urn:microsoft.com/office/officeart/2005/8/layout/orgChart1"/>
-    <dgm:cxn modelId="{04DF0983-791C-43D1-A2C6-A7FEE13C3501}" type="presOf" srcId="{3C21F224-0028-43F7-8120-6BC4FD93406E}" destId="{D5DBBB32-2AEF-44D8-ACCB-9F07F9BE497B}" srcOrd="1" destOrd="0" presId="urn:microsoft.com/office/officeart/2005/8/layout/orgChart1"/>
-    <dgm:cxn modelId="{D9061B87-5556-4F45-9C3B-2BB796E9971E}" type="presOf" srcId="{7DEB1F69-5951-4E91-8742-0D33F3E9726F}" destId="{11A24AAD-4F5F-4584-BB27-68F45D313A90}" srcOrd="0" destOrd="0" presId="urn:microsoft.com/office/officeart/2005/8/layout/orgChart1"/>
-    <dgm:cxn modelId="{6D044A9A-8CFC-442E-B031-882B44A2F3F9}" srcId="{FBC6C2C6-7DAF-4659-95E6-DFCABC76B7EC}" destId="{3C21F224-0028-43F7-8120-6BC4FD93406E}" srcOrd="3" destOrd="0" parTransId="{7DEB1F69-5951-4E91-8742-0D33F3E9726F}" sibTransId="{6E712408-C0C5-409A-8276-838F5B3A1249}"/>
     <dgm:cxn modelId="{8F9F69B1-1304-4276-B836-9A123EAF2A0F}" srcId="{FBC6C2C6-7DAF-4659-95E6-DFCABC76B7EC}" destId="{01C0A4C0-4C0D-4336-825C-FBB300626B2A}" srcOrd="0" destOrd="0" parTransId="{F771143B-0C93-4223-891B-2C5580A9081D}" sibTransId="{213F02B9-FEDD-4E0C-9EED-911E8BAB49EA}"/>
     <dgm:cxn modelId="{F6809AB3-3394-4F9F-9EA5-66D776BFF5B0}" type="presOf" srcId="{C4C5F2A0-62F3-4284-97E3-D6BF701E8340}" destId="{E7A003C0-7AEB-4C63-8B3E-4821A0929CA4}" srcOrd="0" destOrd="0" presId="urn:microsoft.com/office/officeart/2005/8/layout/orgChart1"/>
     <dgm:cxn modelId="{2BD1BEC9-5B7B-4166-9237-F968B7864EB8}" type="presOf" srcId="{FBC6C2C6-7DAF-4659-95E6-DFCABC76B7EC}" destId="{42139694-710E-4E0F-B3D3-66CF02D7EB34}" srcOrd="0" destOrd="0" presId="urn:microsoft.com/office/officeart/2005/8/layout/orgChart1"/>
-    <dgm:cxn modelId="{7A3712E6-5388-4800-AEE5-FDBB1932DB84}" type="presOf" srcId="{3C21F224-0028-43F7-8120-6BC4FD93406E}" destId="{D69B7613-0838-4B69-ABC2-444FC2ADC560}" srcOrd="0" destOrd="0" presId="urn:microsoft.com/office/officeart/2005/8/layout/orgChart1"/>
     <dgm:cxn modelId="{35896AEE-6A80-461D-807C-8F6F292B5310}" type="presOf" srcId="{01C0A4C0-4C0D-4336-825C-FBB300626B2A}" destId="{D52A3997-F632-477A-9CC3-6805579B71D9}" srcOrd="1" destOrd="0" presId="urn:microsoft.com/office/officeart/2005/8/layout/orgChart1"/>
     <dgm:cxn modelId="{F55886C3-BEE5-4A3B-A0B4-005C2673757F}" type="presParOf" srcId="{E7A003C0-7AEB-4C63-8B3E-4821A0929CA4}" destId="{C3A32FC9-B4D6-4093-A819-FAC5E13B186F}" srcOrd="0" destOrd="0" presId="urn:microsoft.com/office/officeart/2005/8/layout/orgChart1"/>
     <dgm:cxn modelId="{059BE39C-8ADF-4590-BA86-688453B5D281}" type="presParOf" srcId="{C3A32FC9-B4D6-4093-A819-FAC5E13B186F}" destId="{E5BD1253-FF64-41E6-97D6-F9CCFA2AB338}" srcOrd="0" destOrd="0" presId="urn:microsoft.com/office/officeart/2005/8/layout/orgChart1"/>
@@ -4240,13 +4134,6 @@
     <dgm:cxn modelId="{FCA9B16E-2001-42F9-AF29-2CE59E117CF2}" type="presParOf" srcId="{D271B0B8-CB11-47F1-B24D-6935A2EE1893}" destId="{80392DB4-8E14-4BDC-A22A-B86C8509A595}" srcOrd="1" destOrd="0" presId="urn:microsoft.com/office/officeart/2005/8/layout/orgChart1"/>
     <dgm:cxn modelId="{AFF700C1-369C-48B8-91F6-668F0D9DC80F}" type="presParOf" srcId="{C5420597-0461-4952-A92D-CA34B0A741FB}" destId="{9634CE69-7362-4D64-A21C-51D1C69ABF5E}" srcOrd="1" destOrd="0" presId="urn:microsoft.com/office/officeart/2005/8/layout/orgChart1"/>
     <dgm:cxn modelId="{895D88BA-DDF0-48B2-80AB-565C21CEAFB1}" type="presParOf" srcId="{C5420597-0461-4952-A92D-CA34B0A741FB}" destId="{AD9DBCBC-6165-4999-8732-14FA4AD1B665}" srcOrd="2" destOrd="0" presId="urn:microsoft.com/office/officeart/2005/8/layout/orgChart1"/>
-    <dgm:cxn modelId="{8121B86E-8382-4F78-8AC0-60A2DD613409}" type="presParOf" srcId="{2ECDB7FC-FF7C-4371-8740-5CFC9B7CA496}" destId="{11A24AAD-4F5F-4584-BB27-68F45D313A90}" srcOrd="6" destOrd="0" presId="urn:microsoft.com/office/officeart/2005/8/layout/orgChart1"/>
-    <dgm:cxn modelId="{7583A101-81E2-468E-93FA-6A971B8A46F8}" type="presParOf" srcId="{2ECDB7FC-FF7C-4371-8740-5CFC9B7CA496}" destId="{5E137D6B-4327-4362-BA47-7A05500BFB52}" srcOrd="7" destOrd="0" presId="urn:microsoft.com/office/officeart/2005/8/layout/orgChart1"/>
-    <dgm:cxn modelId="{DFADA10B-9785-4338-886A-6745A9D0C142}" type="presParOf" srcId="{5E137D6B-4327-4362-BA47-7A05500BFB52}" destId="{93F7292F-D094-4600-8DE3-0D339ED59BE9}" srcOrd="0" destOrd="0" presId="urn:microsoft.com/office/officeart/2005/8/layout/orgChart1"/>
-    <dgm:cxn modelId="{006E6BB0-BF85-4E0D-82D4-FE4E55CFEF20}" type="presParOf" srcId="{93F7292F-D094-4600-8DE3-0D339ED59BE9}" destId="{D69B7613-0838-4B69-ABC2-444FC2ADC560}" srcOrd="0" destOrd="0" presId="urn:microsoft.com/office/officeart/2005/8/layout/orgChart1"/>
-    <dgm:cxn modelId="{4536AE2A-0C22-4223-827D-2071AB5D932E}" type="presParOf" srcId="{93F7292F-D094-4600-8DE3-0D339ED59BE9}" destId="{D5DBBB32-2AEF-44D8-ACCB-9F07F9BE497B}" srcOrd="1" destOrd="0" presId="urn:microsoft.com/office/officeart/2005/8/layout/orgChart1"/>
-    <dgm:cxn modelId="{90A1A130-C5DE-4EE1-907A-80F31291F856}" type="presParOf" srcId="{5E137D6B-4327-4362-BA47-7A05500BFB52}" destId="{2FD5043C-A5BB-47B5-939B-82511445F26D}" srcOrd="1" destOrd="0" presId="urn:microsoft.com/office/officeart/2005/8/layout/orgChart1"/>
-    <dgm:cxn modelId="{BD11A0EA-2B66-4B5C-AA47-F9C302D814CE}" type="presParOf" srcId="{5E137D6B-4327-4362-BA47-7A05500BFB52}" destId="{6FC12D20-B97C-4D55-B46F-BD2637615EB4}" srcOrd="2" destOrd="0" presId="urn:microsoft.com/office/officeart/2005/8/layout/orgChart1"/>
     <dgm:cxn modelId="{6A527F81-33D2-49AF-AE82-D69A0E300257}" type="presParOf" srcId="{C3A32FC9-B4D6-4093-A819-FAC5E13B186F}" destId="{F3987164-6F42-419A-AAAF-3DCD67CC87F8}" srcOrd="2" destOrd="0" presId="urn:microsoft.com/office/officeart/2005/8/layout/orgChart1"/>
   </dgm:cxnLst>
   <dgm:bg/>
@@ -4267,15 +4154,15 @@
       <dsp:cNvGrpSpPr/>
     </dsp:nvGrpSpPr>
     <dsp:grpSpPr/>
-    <dsp:sp modelId="{11A24AAD-4F5F-4584-BB27-68F45D313A90}">
+    <dsp:sp modelId="{48EF1B20-6639-4448-A2AD-54499524E618}">
       <dsp:nvSpPr>
         <dsp:cNvPr id="0" name=""/>
         <dsp:cNvSpPr/>
       </dsp:nvSpPr>
       <dsp:spPr>
         <a:xfrm>
-          <a:off x="1536700" y="1206722"/>
-          <a:ext cx="1203552" cy="139254"/>
+          <a:off x="1536700" y="1182003"/>
+          <a:ext cx="1087226" cy="188692"/>
         </a:xfrm>
         <a:custGeom>
           <a:avLst/>
@@ -4289,74 +4176,13 @@
                 <a:pt x="0" y="0"/>
               </a:moveTo>
               <a:lnTo>
-                <a:pt x="0" y="69627"/>
+                <a:pt x="0" y="94346"/>
               </a:lnTo>
               <a:lnTo>
-                <a:pt x="1203552" y="69627"/>
+                <a:pt x="1087226" y="94346"/>
               </a:lnTo>
               <a:lnTo>
-                <a:pt x="1203552" y="139254"/>
-              </a:lnTo>
-            </a:path>
-          </a:pathLst>
-        </a:custGeom>
-        <a:noFill/>
-        <a:ln w="25400" cap="flat" cmpd="sng" algn="ctr">
-          <a:solidFill>
-            <a:schemeClr val="accent1">
-              <a:shade val="60000"/>
-              <a:hueOff val="0"/>
-              <a:satOff val="0"/>
-              <a:lumOff val="0"/>
-              <a:alphaOff val="0"/>
-            </a:schemeClr>
-          </a:solidFill>
-          <a:prstDash val="solid"/>
-        </a:ln>
-        <a:effectLst/>
-      </dsp:spPr>
-      <dsp:style>
-        <a:lnRef idx="2">
-          <a:scrgbClr r="0" g="0" b="0"/>
-        </a:lnRef>
-        <a:fillRef idx="0">
-          <a:scrgbClr r="0" g="0" b="0"/>
-        </a:fillRef>
-        <a:effectRef idx="0">
-          <a:scrgbClr r="0" g="0" b="0"/>
-        </a:effectRef>
-        <a:fontRef idx="minor"/>
-      </dsp:style>
-    </dsp:sp>
-    <dsp:sp modelId="{48EF1B20-6639-4448-A2AD-54499524E618}">
-      <dsp:nvSpPr>
-        <dsp:cNvPr id="0" name=""/>
-        <dsp:cNvSpPr/>
-      </dsp:nvSpPr>
-      <dsp:spPr>
-        <a:xfrm>
-          <a:off x="1536700" y="1206722"/>
-          <a:ext cx="401184" cy="139254"/>
-        </a:xfrm>
-        <a:custGeom>
-          <a:avLst/>
-          <a:gdLst/>
-          <a:ahLst/>
-          <a:cxnLst/>
-          <a:rect l="0" t="0" r="0" b="0"/>
-          <a:pathLst>
-            <a:path>
-              <a:moveTo>
-                <a:pt x="0" y="0"/>
-              </a:moveTo>
-              <a:lnTo>
-                <a:pt x="0" y="69627"/>
-              </a:lnTo>
-              <a:lnTo>
-                <a:pt x="401184" y="69627"/>
-              </a:lnTo>
-              <a:lnTo>
-                <a:pt x="401184" y="139254"/>
+                <a:pt x="1087226" y="188692"/>
               </a:lnTo>
             </a:path>
           </a:pathLst>
@@ -4396,8 +4222,8 @@
       </dsp:nvSpPr>
       <dsp:spPr>
         <a:xfrm>
-          <a:off x="1135515" y="1206722"/>
-          <a:ext cx="401184" cy="139254"/>
+          <a:off x="1490979" y="1182003"/>
+          <a:ext cx="91440" cy="188692"/>
         </a:xfrm>
         <a:custGeom>
           <a:avLst/>
@@ -4408,16 +4234,10 @@
           <a:pathLst>
             <a:path>
               <a:moveTo>
-                <a:pt x="401184" y="0"/>
+                <a:pt x="45720" y="0"/>
               </a:moveTo>
               <a:lnTo>
-                <a:pt x="401184" y="69627"/>
-              </a:lnTo>
-              <a:lnTo>
-                <a:pt x="0" y="69627"/>
-              </a:lnTo>
-              <a:lnTo>
-                <a:pt x="0" y="139254"/>
+                <a:pt x="45720" y="188692"/>
               </a:lnTo>
             </a:path>
           </a:pathLst>
@@ -4457,8 +4277,8 @@
       </dsp:nvSpPr>
       <dsp:spPr>
         <a:xfrm>
-          <a:off x="333147" y="1206722"/>
-          <a:ext cx="1203552" cy="139254"/>
+          <a:off x="449473" y="1182003"/>
+          <a:ext cx="1087226" cy="188692"/>
         </a:xfrm>
         <a:custGeom>
           <a:avLst/>
@@ -4469,16 +4289,16 @@
           <a:pathLst>
             <a:path>
               <a:moveTo>
-                <a:pt x="1203552" y="0"/>
+                <a:pt x="1087226" y="0"/>
               </a:moveTo>
               <a:lnTo>
-                <a:pt x="1203552" y="69627"/>
+                <a:pt x="1087226" y="94346"/>
               </a:lnTo>
               <a:lnTo>
-                <a:pt x="0" y="69627"/>
+                <a:pt x="0" y="94346"/>
               </a:lnTo>
               <a:lnTo>
-                <a:pt x="0" y="139254"/>
+                <a:pt x="0" y="188692"/>
               </a:lnTo>
             </a:path>
           </a:pathLst>
@@ -4518,8 +4338,8 @@
       </dsp:nvSpPr>
       <dsp:spPr>
         <a:xfrm>
-          <a:off x="1205142" y="875165"/>
-          <a:ext cx="663114" cy="331557"/>
+          <a:off x="1087432" y="732736"/>
+          <a:ext cx="898534" cy="449267"/>
         </a:xfrm>
         <a:prstGeom prst="rect">
           <a:avLst/>
@@ -4592,12 +4412,12 @@
         </a:fontRef>
       </dsp:style>
       <dsp:txBody>
-        <a:bodyPr spcFirstLastPara="0" vert="horz" wrap="square" lIns="4445" tIns="4445" rIns="4445" bIns="4445" numCol="1" spcCol="1270" anchor="ctr" anchorCtr="0">
+        <a:bodyPr spcFirstLastPara="0" vert="horz" wrap="square" lIns="5715" tIns="5715" rIns="5715" bIns="5715" numCol="1" spcCol="1270" anchor="ctr" anchorCtr="0">
           <a:noAutofit/>
         </a:bodyPr>
         <a:lstStyle/>
         <a:p>
-          <a:pPr marL="0" lvl="0" indent="0" algn="ctr" defTabSz="311150">
+          <a:pPr marL="0" lvl="0" indent="0" algn="ctr" defTabSz="400050">
             <a:lnSpc>
               <a:spcPct val="90000"/>
             </a:lnSpc>
@@ -4610,14 +4430,14 @@
             <a:buNone/>
           </a:pPr>
           <a:r>
-            <a:rPr lang="es-MX" sz="700" kern="1200"/>
+            <a:rPr lang="es-MX" sz="900" kern="1200"/>
             <a:t>GERENTE GENERAL</a:t>
           </a:r>
         </a:p>
       </dsp:txBody>
       <dsp:txXfrm>
-        <a:off x="1205142" y="875165"/>
-        <a:ext cx="663114" cy="331557"/>
+        <a:off x="1087432" y="732736"/>
+        <a:ext cx="898534" cy="449267"/>
       </dsp:txXfrm>
     </dsp:sp>
     <dsp:sp modelId="{0AE09A4A-865F-46BA-B1CF-67BB004CBF34}">
@@ -4627,8 +4447,8 @@
       </dsp:nvSpPr>
       <dsp:spPr>
         <a:xfrm>
-          <a:off x="1589" y="1345977"/>
-          <a:ext cx="663114" cy="331557"/>
+          <a:off x="206" y="1370696"/>
+          <a:ext cx="898534" cy="449267"/>
         </a:xfrm>
         <a:prstGeom prst="rect">
           <a:avLst/>
@@ -4672,12 +4492,12 @@
         </a:fontRef>
       </dsp:style>
       <dsp:txBody>
-        <a:bodyPr spcFirstLastPara="0" vert="horz" wrap="square" lIns="4445" tIns="4445" rIns="4445" bIns="4445" numCol="1" spcCol="1270" anchor="ctr" anchorCtr="0">
+        <a:bodyPr spcFirstLastPara="0" vert="horz" wrap="square" lIns="5715" tIns="5715" rIns="5715" bIns="5715" numCol="1" spcCol="1270" anchor="ctr" anchorCtr="0">
           <a:noAutofit/>
         </a:bodyPr>
         <a:lstStyle/>
         <a:p>
-          <a:pPr marL="0" lvl="0" indent="0" algn="ctr" defTabSz="311150">
+          <a:pPr marL="0" lvl="0" indent="0" algn="ctr" defTabSz="400050">
             <a:lnSpc>
               <a:spcPct val="90000"/>
             </a:lnSpc>
@@ -4690,14 +4510,14 @@
             <a:buNone/>
           </a:pPr>
           <a:r>
-            <a:rPr lang="es-MX" sz="700" kern="1200"/>
+            <a:rPr lang="es-MX" sz="900" kern="1200"/>
             <a:t>ENCARGADO DE MOSTRADOR</a:t>
           </a:r>
         </a:p>
       </dsp:txBody>
       <dsp:txXfrm>
-        <a:off x="1589" y="1345977"/>
-        <a:ext cx="663114" cy="331557"/>
+        <a:off x="206" y="1370696"/>
+        <a:ext cx="898534" cy="449267"/>
       </dsp:txXfrm>
     </dsp:sp>
     <dsp:sp modelId="{03AA56DD-BB38-41C5-85DA-7449B7097E61}">
@@ -4707,8 +4527,8 @@
       </dsp:nvSpPr>
       <dsp:spPr>
         <a:xfrm>
-          <a:off x="803958" y="1345977"/>
-          <a:ext cx="663114" cy="331557"/>
+          <a:off x="1087432" y="1370696"/>
+          <a:ext cx="898534" cy="449267"/>
         </a:xfrm>
         <a:prstGeom prst="rect">
           <a:avLst/>
@@ -4781,12 +4601,12 @@
         </a:fontRef>
       </dsp:style>
       <dsp:txBody>
-        <a:bodyPr spcFirstLastPara="0" vert="horz" wrap="square" lIns="4445" tIns="4445" rIns="4445" bIns="4445" numCol="1" spcCol="1270" anchor="ctr" anchorCtr="0">
+        <a:bodyPr spcFirstLastPara="0" vert="horz" wrap="square" lIns="5715" tIns="5715" rIns="5715" bIns="5715" numCol="1" spcCol="1270" anchor="ctr" anchorCtr="0">
           <a:noAutofit/>
         </a:bodyPr>
         <a:lstStyle/>
         <a:p>
-          <a:pPr marL="0" lvl="0" indent="0" algn="ctr" defTabSz="311150">
+          <a:pPr marL="0" lvl="0" indent="0" algn="ctr" defTabSz="400050">
             <a:lnSpc>
               <a:spcPct val="90000"/>
             </a:lnSpc>
@@ -4799,14 +4619,14 @@
             <a:buNone/>
           </a:pPr>
           <a:r>
-            <a:rPr lang="es-MX" sz="700" kern="1200"/>
+            <a:rPr lang="es-MX" sz="900" kern="1200"/>
             <a:t>DISEÑADOR GRÁFICO</a:t>
           </a:r>
         </a:p>
       </dsp:txBody>
       <dsp:txXfrm>
-        <a:off x="803958" y="1345977"/>
-        <a:ext cx="663114" cy="331557"/>
+        <a:off x="1087432" y="1370696"/>
+        <a:ext cx="898534" cy="449267"/>
       </dsp:txXfrm>
     </dsp:sp>
     <dsp:sp modelId="{4FD19808-1664-4492-A4B2-749AA80D9B0C}">
@@ -4816,8 +4636,8 @@
       </dsp:nvSpPr>
       <dsp:spPr>
         <a:xfrm>
-          <a:off x="1606327" y="1345977"/>
-          <a:ext cx="663114" cy="331557"/>
+          <a:off x="2174659" y="1370696"/>
+          <a:ext cx="898534" cy="449267"/>
         </a:xfrm>
         <a:prstGeom prst="rect">
           <a:avLst/>
@@ -4890,12 +4710,12 @@
         </a:fontRef>
       </dsp:style>
       <dsp:txBody>
-        <a:bodyPr spcFirstLastPara="0" vert="horz" wrap="square" lIns="4445" tIns="4445" rIns="4445" bIns="4445" numCol="1" spcCol="1270" anchor="ctr" anchorCtr="0">
+        <a:bodyPr spcFirstLastPara="0" vert="horz" wrap="square" lIns="5715" tIns="5715" rIns="5715" bIns="5715" numCol="1" spcCol="1270" anchor="ctr" anchorCtr="0">
           <a:noAutofit/>
         </a:bodyPr>
         <a:lstStyle/>
         <a:p>
-          <a:pPr marL="0" lvl="0" indent="0" algn="ctr" defTabSz="311150">
+          <a:pPr marL="0" lvl="0" indent="0" algn="ctr" defTabSz="400050">
             <a:lnSpc>
               <a:spcPct val="90000"/>
             </a:lnSpc>
@@ -4908,123 +4728,14 @@
             <a:buNone/>
           </a:pPr>
           <a:r>
-            <a:rPr lang="es-MX" sz="700" kern="1200"/>
+            <a:rPr lang="es-MX" sz="900" kern="1200"/>
             <a:t>ENCARGADO DE IMPRESION A GRAN TAMAÑO</a:t>
           </a:r>
         </a:p>
       </dsp:txBody>
       <dsp:txXfrm>
-        <a:off x="1606327" y="1345977"/>
-        <a:ext cx="663114" cy="331557"/>
-      </dsp:txXfrm>
-    </dsp:sp>
-    <dsp:sp modelId="{D69B7613-0838-4B69-ABC2-444FC2ADC560}">
-      <dsp:nvSpPr>
-        <dsp:cNvPr id="0" name=""/>
-        <dsp:cNvSpPr/>
-      </dsp:nvSpPr>
-      <dsp:spPr>
-        <a:xfrm>
-          <a:off x="2408695" y="1345977"/>
-          <a:ext cx="663114" cy="331557"/>
-        </a:xfrm>
-        <a:prstGeom prst="rect">
-          <a:avLst/>
-        </a:prstGeom>
-        <a:gradFill rotWithShape="0">
-          <a:gsLst>
-            <a:gs pos="0">
-              <a:schemeClr val="accent1">
-                <a:hueOff val="0"/>
-                <a:satOff val="0"/>
-                <a:lumOff val="0"/>
-                <a:alphaOff val="0"/>
-                <a:tint val="50000"/>
-                <a:satMod val="300000"/>
-              </a:schemeClr>
-            </a:gs>
-            <a:gs pos="35000">
-              <a:schemeClr val="accent1">
-                <a:hueOff val="0"/>
-                <a:satOff val="0"/>
-                <a:lumOff val="0"/>
-                <a:alphaOff val="0"/>
-                <a:tint val="37000"/>
-                <a:satMod val="300000"/>
-              </a:schemeClr>
-            </a:gs>
-            <a:gs pos="100000">
-              <a:schemeClr val="accent1">
-                <a:hueOff val="0"/>
-                <a:satOff val="0"/>
-                <a:lumOff val="0"/>
-                <a:alphaOff val="0"/>
-                <a:tint val="15000"/>
-                <a:satMod val="350000"/>
-              </a:schemeClr>
-            </a:gs>
-          </a:gsLst>
-          <a:lin ang="16200000" scaled="1"/>
-        </a:gradFill>
-        <a:ln>
-          <a:noFill/>
-        </a:ln>
-        <a:effectLst>
-          <a:outerShdw blurRad="40000" dist="20000" dir="5400000" rotWithShape="0">
-            <a:srgbClr val="000000">
-              <a:alpha val="38000"/>
-            </a:srgbClr>
-          </a:outerShdw>
-        </a:effectLst>
-        <a:scene3d>
-          <a:camera prst="orthographicFront"/>
-          <a:lightRig rig="flat" dir="t"/>
-        </a:scene3d>
-        <a:sp3d prstMaterial="dkEdge">
-          <a:bevelT w="8200" h="38100"/>
-        </a:sp3d>
-      </dsp:spPr>
-      <dsp:style>
-        <a:lnRef idx="0">
-          <a:scrgbClr r="0" g="0" b="0"/>
-        </a:lnRef>
-        <a:fillRef idx="2">
-          <a:scrgbClr r="0" g="0" b="0"/>
-        </a:fillRef>
-        <a:effectRef idx="1">
-          <a:scrgbClr r="0" g="0" b="0"/>
-        </a:effectRef>
-        <a:fontRef idx="minor">
-          <a:schemeClr val="dk1"/>
-        </a:fontRef>
-      </dsp:style>
-      <dsp:txBody>
-        <a:bodyPr spcFirstLastPara="0" vert="horz" wrap="square" lIns="4445" tIns="4445" rIns="4445" bIns="4445" numCol="1" spcCol="1270" anchor="ctr" anchorCtr="0">
-          <a:noAutofit/>
-        </a:bodyPr>
-        <a:lstStyle/>
-        <a:p>
-          <a:pPr marL="0" lvl="0" indent="0" algn="ctr" defTabSz="311150">
-            <a:lnSpc>
-              <a:spcPct val="90000"/>
-            </a:lnSpc>
-            <a:spcBef>
-              <a:spcPct val="0"/>
-            </a:spcBef>
-            <a:spcAft>
-              <a:spcPct val="35000"/>
-            </a:spcAft>
-            <a:buNone/>
-          </a:pPr>
-          <a:r>
-            <a:rPr lang="es-MX" sz="700" kern="1200"/>
-            <a:t>TÉCNICO EN IMPRESIÓN ESPECIALIZADA</a:t>
-          </a:r>
-        </a:p>
-      </dsp:txBody>
-      <dsp:txXfrm>
-        <a:off x="2408695" y="1345977"/>
-        <a:ext cx="663114" cy="331557"/>
+        <a:off x="2174659" y="1370696"/>
+        <a:ext cx="898534" cy="449267"/>
       </dsp:txXfrm>
     </dsp:sp>
   </dsp:spTree>

</xml_diff>